<commit_message>
feat(ahg): a clean conference frame, the sample course at /ahg/site, and the kit online at /ahg/kit
- /ahg, the share page and the new pages use their own plain frame: skip
  link, one heading, the content, Privacy Policy and Hosted by GLOW. None
  of GLOW's navigation, AI meter or footer links
- /ahg/site: PSY 101 online, with each file's checker report; the
  announcement keeps its planted barriers under its own narrow CSP so axe
  and Accessibility Insights can run on a real address
- /ahg/kit: every kit file readable as a page (Markdown through Pandoc,
  raw HTML off) and as plain text at /ahg/kit/raw/<path>; /ahg/kit.zip for
  the download; only files in the kit are served
- The slides open without the consent page
- The kit's offline share page is rendered from the same template
- Tests for the frame, the routes and path safety; browser checks cover the
  new pages in light and dark, at 320px, and by keyboard

Co-Authored-By: Claude Opus 5.5 <noreply@anthropic.com>
</commit_message>
<xml_diff>
--- a/docs/ahg-2026/kit/step-cards/4-ground-it.docx
+++ b/docs/ahg-2026/kit/step-cards/4-ground-it.docx
@@ -95,6 +95,14 @@
       </w:pPr>
       <w:r>
         <w:t>Optional: open the syllabus in Word, choose Review, then Check Accessibility, and paste the results into Copilot Chat with your agent. Same skill, different checker.</w:t>
+      </w:r>
+    </w:p>
+    <w:p>
+      <w:pPr>
+        <w:pStyle w:val="ListNumber"/>
+      </w:pPr>
+      <w:r>
+        <w:t>Optional: the course announcement is online at letitglow.app/ahg/site. Run Accessibility Insights FastPass on it and compare with its checker report.</w:t>
       </w:r>
     </w:p>
     <w:p>

</xml_diff>

<commit_message>
feat(ahg): a clean conference frame, the sample course at /ahg/site, and the kit online at /ahg/kit (#121)
- /ahg, the share page and the new pages use their own plain frame: skip
  link, one heading, the content, Privacy Policy and Hosted by GLOW. None
  of GLOW's navigation, AI meter or footer links
- /ahg/site: PSY 101 online, with each file's checker report; the
  announcement keeps its planted barriers under its own narrow CSP so axe
  and Accessibility Insights can run on a real address
- /ahg/kit: every kit file readable as a page (Markdown through Pandoc,
  raw HTML off) and as plain text at /ahg/kit/raw/<path>; /ahg/kit.zip for
  the download; only files in the kit are served
- The slides open without the consent page
- The kit's offline share page is rendered from the same template
- Tests for the frame, the routes and path safety; browser checks cover the
  new pages in light and dark, at 320px, and by keyboard

Co-authored-by: Claude Opus 5.5 <noreply@anthropic.com>
</commit_message>
<xml_diff>
--- a/docs/ahg-2026/kit/step-cards/4-ground-it.docx
+++ b/docs/ahg-2026/kit/step-cards/4-ground-it.docx
@@ -95,6 +95,14 @@
       </w:pPr>
       <w:r>
         <w:t>Optional: open the syllabus in Word, choose Review, then Check Accessibility, and paste the results into Copilot Chat with your agent. Same skill, different checker.</w:t>
+      </w:r>
+    </w:p>
+    <w:p>
+      <w:pPr>
+        <w:pStyle w:val="ListNumber"/>
+      </w:pPr>
+      <w:r>
+        <w:t>Optional: the course announcement is online at letitglow.app/ahg/site. Run Accessibility Insights FastPass on it and compare with its checker report.</w:t>
       </w:r>
     </w:p>
     <w:p>

</xml_diff>